<commit_message>
hinzufügen einer neuen Aufgabe beim Projektplan
</commit_message>
<xml_diff>
--- a/Projektplanung TypeLeague.docx
+++ b/Projektplanung TypeLeague.docx
@@ -12,7 +12,6 @@
           <w:lang w:val="de-DE"/>
         </w:rPr>
       </w:pPr>
-      <w:proofErr w:type="spellStart"/>
       <w:r>
         <w:rPr>
           <w:b/>
@@ -23,7 +22,6 @@
         </w:rPr>
         <w:t>UserStories</w:t>
       </w:r>
-      <w:proofErr w:type="spellEnd"/>
     </w:p>
     <w:p>
       <w:pPr>
@@ -97,7 +95,6 @@
           <w:lang w:val="de-DE"/>
         </w:rPr>
       </w:pPr>
-      <w:proofErr w:type="spellStart"/>
       <w:r>
         <w:rPr>
           <w:b/>
@@ -106,18 +103,7 @@
           <w:szCs w:val="32"/>
           <w:lang w:val="de-DE"/>
         </w:rPr>
-        <w:t>TypeLeague</w:t>
-      </w:r>
-      <w:proofErr w:type="spellEnd"/>
-      <w:r>
-        <w:rPr>
-          <w:b/>
-          <w:bCs/>
-          <w:sz w:val="32"/>
-          <w:szCs w:val="32"/>
-          <w:lang w:val="de-DE"/>
-        </w:rPr>
-        <w:t xml:space="preserve"> Projekt Planung</w:t>
+        <w:t>TypeLeague Projekt Planung</w:t>
       </w:r>
     </w:p>
     <w:tbl>
@@ -1759,6 +1745,42 @@
         </w:rPr>
         <w:t>Homepage + Login</w:t>
       </w:r>
+      <w:r>
+        <w:rPr>
+          <w:lang w:val="de-DE"/>
+        </w:rPr>
+        <w:t xml:space="preserve"> + Stats</w:t>
+      </w:r>
+    </w:p>
+    <w:p>
+      <w:pPr>
+        <w:pStyle w:val="Listenabsatz"/>
+        <w:numPr>
+          <w:ilvl w:val="2"/>
+          <w:numId w:val="1"/>
+        </w:numPr>
+        <w:rPr>
+          <w:lang w:val="de-DE"/>
+        </w:rPr>
+      </w:pPr>
+      <w:r>
+        <w:rPr>
+          <w:lang w:val="de-DE"/>
+        </w:rPr>
+        <w:t>Hash-</w:t>
+      </w:r>
+      <w:r>
+        <w:rPr>
+          <w:lang w:val="de-DE"/>
+        </w:rPr>
+        <w:t>algorithmus</w:t>
+      </w:r>
+      <w:r>
+        <w:rPr>
+          <w:lang w:val="de-DE"/>
+        </w:rPr>
+        <w:t>: Bcrypt</w:t>
+      </w:r>
     </w:p>
     <w:p>
       <w:pPr>
@@ -1843,14 +1865,12 @@
           <w:lang w:val="de-DE"/>
         </w:rPr>
       </w:pPr>
-      <w:proofErr w:type="spellStart"/>
       <w:r>
         <w:rPr>
           <w:lang w:val="de-DE"/>
         </w:rPr>
         <w:t>Leaderboard</w:t>
       </w:r>
-      <w:proofErr w:type="spellEnd"/>
     </w:p>
     <w:p>
       <w:pPr>
@@ -2048,7 +2068,7 @@
         <w:rFonts w:ascii="Wingdings" w:hAnsi="Wingdings" w:hint="default"/>
       </w:rPr>
     </w:lvl>
-    <w:lvl w:ilvl="3" w:tplc="08070001" w:tentative="1">
+    <w:lvl w:ilvl="3" w:tplc="08070001">
       <w:start w:val="1"/>
       <w:numFmt w:val="bullet"/>
       <w:lvlText w:val=""/>
@@ -2060,7 +2080,7 @@
         <w:rFonts w:ascii="Symbol" w:hAnsi="Symbol" w:hint="default"/>
       </w:rPr>
     </w:lvl>
-    <w:lvl w:ilvl="4" w:tplc="08070003" w:tentative="1">
+    <w:lvl w:ilvl="4" w:tplc="08070003">
       <w:start w:val="1"/>
       <w:numFmt w:val="bullet"/>
       <w:lvlText w:val="o"/>
@@ -2072,7 +2092,7 @@
         <w:rFonts w:ascii="Courier New" w:hAnsi="Courier New" w:cs="Courier New" w:hint="default"/>
       </w:rPr>
     </w:lvl>
-    <w:lvl w:ilvl="5" w:tplc="08070005" w:tentative="1">
+    <w:lvl w:ilvl="5" w:tplc="08070005">
       <w:start w:val="1"/>
       <w:numFmt w:val="bullet"/>
       <w:lvlText w:val=""/>
@@ -2084,7 +2104,7 @@
         <w:rFonts w:ascii="Wingdings" w:hAnsi="Wingdings" w:hint="default"/>
       </w:rPr>
     </w:lvl>
-    <w:lvl w:ilvl="6" w:tplc="08070001" w:tentative="1">
+    <w:lvl w:ilvl="6" w:tplc="08070001">
       <w:start w:val="1"/>
       <w:numFmt w:val="bullet"/>
       <w:lvlText w:val=""/>
@@ -2096,7 +2116,7 @@
         <w:rFonts w:ascii="Symbol" w:hAnsi="Symbol" w:hint="default"/>
       </w:rPr>
     </w:lvl>
-    <w:lvl w:ilvl="7" w:tplc="08070003" w:tentative="1">
+    <w:lvl w:ilvl="7" w:tplc="08070003">
       <w:start w:val="1"/>
       <w:numFmt w:val="bullet"/>
       <w:lvlText w:val="o"/>
@@ -2108,7 +2128,7 @@
         <w:rFonts w:ascii="Courier New" w:hAnsi="Courier New" w:cs="Courier New" w:hint="default"/>
       </w:rPr>
     </w:lvl>
-    <w:lvl w:ilvl="8" w:tplc="08070005" w:tentative="1">
+    <w:lvl w:ilvl="8" w:tplc="08070005">
       <w:start w:val="1"/>
       <w:numFmt w:val="bullet"/>
       <w:lvlText w:val=""/>

</xml_diff>